<commit_message>
Homework 3 start on page 11
</commit_message>
<xml_diff>
--- a/parking_app.docx
+++ b/parking_app.docx
@@ -129,19 +129,7 @@
     </w:p>
     <w:p>
       <w:r>
-        <w:t xml:space="preserve">We are </w:t>
-      </w:r>
-      <w:r>
-        <w:t>S</w:t>
-      </w:r>
-      <w:r>
-        <w:t xml:space="preserve">oftware </w:t>
-      </w:r>
-      <w:r>
-        <w:t>C</w:t>
-      </w:r>
-      <w:r>
-        <w:t xml:space="preserve">orp. A software development studio. This project came about after parking facility operators and city transportation stakeholders flagged a recurring problem: drivers waste a lot of time hunting for open spaces, which adds to congestion and eats into </w:t>
+        <w:t xml:space="preserve">We are Software Corp. A software development studio. This project came about after parking facility operators and city transportation stakeholders flagged a recurring problem: drivers waste a lot of time hunting for open spaces, which adds to congestion and eats into </w:t>
       </w:r>
       <w:r>
         <w:lastRenderedPageBreak/>
@@ -2556,16 +2544,7 @@
         <w:spacing w:after="0"/>
       </w:pPr>
       <w:r>
-        <w:t xml:space="preserve">Level </w:t>
-      </w:r>
-      <w:r>
-        <w:t>3</w:t>
-      </w:r>
-      <w:r>
-        <w:t xml:space="preserve">: </w:t>
-      </w:r>
-      <w:r>
-        <w:t>Work Packages</w:t>
+        <w:t>Level 3: Work Packages</w:t>
       </w:r>
     </w:p>
     <w:p>
@@ -5646,13 +5625,13 @@
           <w:noProof/>
         </w:rPr>
         <w:drawing>
-          <wp:anchor distT="0" distB="0" distL="114300" distR="114300" simplePos="0" relativeHeight="251692032" behindDoc="0" locked="0" layoutInCell="1" allowOverlap="1" wp14:anchorId="58912B12" wp14:editId="07480832">
+          <wp:anchor distT="0" distB="0" distL="114300" distR="114300" simplePos="0" relativeHeight="251692032" behindDoc="0" locked="0" layoutInCell="1" allowOverlap="1" wp14:anchorId="58912B12" wp14:editId="4831209E">
             <wp:simplePos x="0" y="0"/>
             <wp:positionH relativeFrom="column">
-              <wp:posOffset>-377825</wp:posOffset>
+              <wp:posOffset>-492850</wp:posOffset>
             </wp:positionH>
             <wp:positionV relativeFrom="paragraph">
-              <wp:posOffset>189230</wp:posOffset>
+              <wp:posOffset>115660</wp:posOffset>
             </wp:positionV>
             <wp:extent cx="6669532" cy="2948940"/>
             <wp:effectExtent l="0" t="0" r="10795" b="10160"/>
@@ -5679,6 +5658,368 @@
           </wp:anchor>
         </w:drawing>
       </w:r>
+    </w:p>
+    <w:p>
+      <w:pPr>
+        <w:spacing w:after="0"/>
+      </w:pPr>
+    </w:p>
+    <w:p>
+      <w:pPr>
+        <w:spacing w:after="0"/>
+      </w:pPr>
+    </w:p>
+    <w:p>
+      <w:pPr>
+        <w:spacing w:after="0"/>
+      </w:pPr>
+    </w:p>
+    <w:p>
+      <w:pPr>
+        <w:spacing w:after="0"/>
+      </w:pPr>
+    </w:p>
+    <w:p>
+      <w:pPr>
+        <w:spacing w:after="0"/>
+      </w:pPr>
+    </w:p>
+    <w:p>
+      <w:pPr>
+        <w:spacing w:after="0"/>
+      </w:pPr>
+    </w:p>
+    <w:p>
+      <w:pPr>
+        <w:spacing w:after="0"/>
+      </w:pPr>
+    </w:p>
+    <w:p>
+      <w:pPr>
+        <w:spacing w:after="0"/>
+      </w:pPr>
+    </w:p>
+    <w:p>
+      <w:pPr>
+        <w:spacing w:after="0"/>
+      </w:pPr>
+    </w:p>
+    <w:p>
+      <w:pPr>
+        <w:spacing w:after="0"/>
+      </w:pPr>
+    </w:p>
+    <w:p>
+      <w:pPr>
+        <w:spacing w:after="0"/>
+      </w:pPr>
+    </w:p>
+    <w:p>
+      <w:pPr>
+        <w:spacing w:after="0"/>
+      </w:pPr>
+    </w:p>
+    <w:p>
+      <w:pPr>
+        <w:spacing w:after="0"/>
+      </w:pPr>
+    </w:p>
+    <w:p>
+      <w:pPr>
+        <w:spacing w:after="0"/>
+      </w:pPr>
+    </w:p>
+    <w:p>
+      <w:pPr>
+        <w:spacing w:after="0"/>
+      </w:pPr>
+    </w:p>
+    <w:p>
+      <w:pPr>
+        <w:spacing w:after="0"/>
+      </w:pPr>
+      <w:r>
+        <w:rPr>
+          <w:noProof/>
+        </w:rPr>
+        <w:lastRenderedPageBreak/>
+        <w:drawing>
+          <wp:anchor distT="0" distB="0" distL="114300" distR="114300" simplePos="0" relativeHeight="251693056" behindDoc="0" locked="0" layoutInCell="1" allowOverlap="1" wp14:anchorId="4A3796F0" wp14:editId="64BA921B">
+            <wp:simplePos x="0" y="0"/>
+            <wp:positionH relativeFrom="column">
+              <wp:posOffset>-914400</wp:posOffset>
+            </wp:positionH>
+            <wp:positionV relativeFrom="paragraph">
+              <wp:posOffset>170</wp:posOffset>
+            </wp:positionV>
+            <wp:extent cx="13141933" cy="9259200"/>
+            <wp:effectExtent l="0" t="0" r="3175" b="0"/>
+            <wp:wrapTopAndBottom/>
+            <wp:docPr id="1396554191" name="Picture 17"/>
+            <wp:cNvGraphicFramePr>
+              <a:graphicFrameLocks xmlns:a="http://schemas.openxmlformats.org/drawingml/2006/main" noChangeAspect="1"/>
+            </wp:cNvGraphicFramePr>
+            <a:graphic xmlns:a="http://schemas.openxmlformats.org/drawingml/2006/main">
+              <a:graphicData uri="http://schemas.openxmlformats.org/drawingml/2006/picture">
+                <pic:pic xmlns:pic="http://schemas.openxmlformats.org/drawingml/2006/picture">
+                  <pic:nvPicPr>
+                    <pic:cNvPr id="1396554191" name="Picture 1396554191"/>
+                    <pic:cNvPicPr/>
+                  </pic:nvPicPr>
+                  <pic:blipFill>
+                    <a:blip r:embed="rId6">
+                      <a:extLst>
+                        <a:ext uri="{28A0092B-C50C-407E-A947-70E740481C1C}">
+                          <a14:useLocalDpi xmlns:a14="http://schemas.microsoft.com/office/drawing/2010/main" val="0"/>
+                        </a:ext>
+                      </a:extLst>
+                    </a:blip>
+                    <a:stretch>
+                      <a:fillRect/>
+                    </a:stretch>
+                  </pic:blipFill>
+                  <pic:spPr>
+                    <a:xfrm>
+                      <a:off x="0" y="0"/>
+                      <a:ext cx="13141933" cy="9259200"/>
+                    </a:xfrm>
+                    <a:prstGeom prst="rect">
+                      <a:avLst/>
+                    </a:prstGeom>
+                  </pic:spPr>
+                </pic:pic>
+              </a:graphicData>
+            </a:graphic>
+            <wp14:sizeRelH relativeFrom="page">
+              <wp14:pctWidth>0</wp14:pctWidth>
+            </wp14:sizeRelH>
+            <wp14:sizeRelV relativeFrom="page">
+              <wp14:pctHeight>0</wp14:pctHeight>
+            </wp14:sizeRelV>
+          </wp:anchor>
+        </w:drawing>
+      </w:r>
+    </w:p>
+    <w:p>
+      <w:pPr>
+        <w:spacing w:after="0"/>
+      </w:pPr>
+    </w:p>
+    <w:p>
+      <w:pPr>
+        <w:spacing w:after="0"/>
+      </w:pPr>
+    </w:p>
+    <w:p>
+      <w:pPr>
+        <w:spacing w:after="0"/>
+      </w:pPr>
+    </w:p>
+    <w:p>
+      <w:pPr>
+        <w:spacing w:after="0"/>
+      </w:pPr>
+    </w:p>
+    <w:p>
+      <w:pPr>
+        <w:spacing w:after="0"/>
+      </w:pPr>
+    </w:p>
+    <w:p>
+      <w:pPr>
+        <w:spacing w:after="0"/>
+      </w:pPr>
+    </w:p>
+    <w:p>
+      <w:pPr>
+        <w:spacing w:after="0"/>
+      </w:pPr>
+    </w:p>
+    <w:p>
+      <w:pPr>
+        <w:spacing w:after="0"/>
+      </w:pPr>
+    </w:p>
+    <w:p>
+      <w:pPr>
+        <w:spacing w:after="0"/>
+      </w:pPr>
+    </w:p>
+    <w:p>
+      <w:pPr>
+        <w:spacing w:after="0"/>
+      </w:pPr>
+    </w:p>
+    <w:p>
+      <w:pPr>
+        <w:spacing w:after="0"/>
+      </w:pPr>
+    </w:p>
+    <w:p>
+      <w:pPr>
+        <w:spacing w:after="0"/>
+      </w:pPr>
+    </w:p>
+    <w:p>
+      <w:pPr>
+        <w:spacing w:after="0"/>
+      </w:pPr>
+    </w:p>
+    <w:p>
+      <w:pPr>
+        <w:spacing w:after="0"/>
+      </w:pPr>
+    </w:p>
+    <w:p>
+      <w:pPr>
+        <w:spacing w:after="0"/>
+      </w:pPr>
+    </w:p>
+    <w:p>
+      <w:pPr>
+        <w:spacing w:after="0"/>
+      </w:pPr>
+    </w:p>
+    <w:p>
+      <w:pPr>
+        <w:spacing w:after="0"/>
+      </w:pPr>
+    </w:p>
+    <w:p>
+      <w:pPr>
+        <w:spacing w:after="0"/>
+      </w:pPr>
+    </w:p>
+    <w:p>
+      <w:pPr>
+        <w:spacing w:after="0"/>
+      </w:pPr>
+    </w:p>
+    <w:p>
+      <w:pPr>
+        <w:spacing w:after="0"/>
+      </w:pPr>
+    </w:p>
+    <w:p>
+      <w:pPr>
+        <w:spacing w:after="0"/>
+      </w:pPr>
+    </w:p>
+    <w:p>
+      <w:pPr>
+        <w:spacing w:after="0"/>
+      </w:pPr>
+    </w:p>
+    <w:p>
+      <w:pPr>
+        <w:spacing w:after="0"/>
+      </w:pPr>
+    </w:p>
+    <w:p>
+      <w:pPr>
+        <w:spacing w:after="0"/>
+      </w:pPr>
+    </w:p>
+    <w:p>
+      <w:pPr>
+        <w:spacing w:after="0"/>
+      </w:pPr>
+    </w:p>
+    <w:p>
+      <w:pPr>
+        <w:spacing w:after="0"/>
+      </w:pPr>
+      <w:r>
+        <w:rPr>
+          <w:noProof/>
+        </w:rPr>
+        <w:lastRenderedPageBreak/>
+        <w:drawing>
+          <wp:anchor distT="0" distB="0" distL="114300" distR="114300" simplePos="0" relativeHeight="251694080" behindDoc="0" locked="0" layoutInCell="1" allowOverlap="1" wp14:anchorId="0EF67387" wp14:editId="4F044A22">
+            <wp:simplePos x="0" y="0"/>
+            <wp:positionH relativeFrom="column">
+              <wp:posOffset>-914840</wp:posOffset>
+            </wp:positionH>
+            <wp:positionV relativeFrom="paragraph">
+              <wp:posOffset>385</wp:posOffset>
+            </wp:positionV>
+            <wp:extent cx="13398623" cy="9432000"/>
+            <wp:effectExtent l="0" t="0" r="0" b="4445"/>
+            <wp:wrapTopAndBottom/>
+            <wp:docPr id="1790291905" name="Picture 18"/>
+            <wp:cNvGraphicFramePr>
+              <a:graphicFrameLocks xmlns:a="http://schemas.openxmlformats.org/drawingml/2006/main" noChangeAspect="1"/>
+            </wp:cNvGraphicFramePr>
+            <a:graphic xmlns:a="http://schemas.openxmlformats.org/drawingml/2006/main">
+              <a:graphicData uri="http://schemas.openxmlformats.org/drawingml/2006/picture">
+                <pic:pic xmlns:pic="http://schemas.openxmlformats.org/drawingml/2006/picture">
+                  <pic:nvPicPr>
+                    <pic:cNvPr id="1790291905" name="Picture 1790291905"/>
+                    <pic:cNvPicPr/>
+                  </pic:nvPicPr>
+                  <pic:blipFill>
+                    <a:blip r:embed="rId7">
+                      <a:extLst>
+                        <a:ext uri="{28A0092B-C50C-407E-A947-70E740481C1C}">
+                          <a14:useLocalDpi xmlns:a14="http://schemas.microsoft.com/office/drawing/2010/main" val="0"/>
+                        </a:ext>
+                      </a:extLst>
+                    </a:blip>
+                    <a:stretch>
+                      <a:fillRect/>
+                    </a:stretch>
+                  </pic:blipFill>
+                  <pic:spPr>
+                    <a:xfrm>
+                      <a:off x="0" y="0"/>
+                      <a:ext cx="13506563" cy="9507985"/>
+                    </a:xfrm>
+                    <a:prstGeom prst="rect">
+                      <a:avLst/>
+                    </a:prstGeom>
+                  </pic:spPr>
+                </pic:pic>
+              </a:graphicData>
+            </a:graphic>
+            <wp14:sizeRelH relativeFrom="page">
+              <wp14:pctWidth>0</wp14:pctWidth>
+            </wp14:sizeRelH>
+            <wp14:sizeRelV relativeFrom="page">
+              <wp14:pctHeight>0</wp14:pctHeight>
+            </wp14:sizeRelV>
+          </wp:anchor>
+        </w:drawing>
+      </w:r>
+    </w:p>
+    <w:p>
+      <w:pPr>
+        <w:spacing w:after="0"/>
+      </w:pPr>
+    </w:p>
+    <w:p>
+      <w:pPr>
+        <w:spacing w:after="0"/>
+      </w:pPr>
+    </w:p>
+    <w:p>
+      <w:pPr>
+        <w:spacing w:after="0"/>
+      </w:pPr>
+    </w:p>
+    <w:p>
+      <w:pPr>
+        <w:spacing w:after="0"/>
+      </w:pPr>
+    </w:p>
+    <w:p>
+      <w:pPr>
+        <w:spacing w:after="0"/>
+      </w:pPr>
+    </w:p>
+    <w:p>
+      <w:pPr>
+        <w:spacing w:after="0"/>
+      </w:pPr>
     </w:p>
     <w:sectPr>
       <w:pgSz w:w="12240" w:h="15840"/>

</xml_diff>

<commit_message>
HW4 Starts on Page 14
</commit_message>
<xml_diff>
--- a/parking_app.docx
+++ b/parking_app.docx
@@ -5646,7 +5646,7 @@
             <wp:cNvGraphicFramePr/>
             <a:graphic xmlns:a="http://schemas.openxmlformats.org/drawingml/2006/main">
               <a:graphicData uri="http://schemas.openxmlformats.org/drawingml/2006/chart">
-                <c:chart xmlns:c="http://schemas.openxmlformats.org/drawingml/2006/chart" xmlns:r="http://schemas.openxmlformats.org/officeDocument/2006/relationships" r:id="rId5"/>
+                <c:chart xmlns:c="http://schemas.openxmlformats.org/drawingml/2006/chart" xmlns:r="http://schemas.openxmlformats.org/officeDocument/2006/relationships" r:id="rId7"/>
               </a:graphicData>
             </a:graphic>
             <wp14:sizeRelH relativeFrom="page">
@@ -5767,7 +5767,7 @@
                     <pic:cNvPicPr/>
                   </pic:nvPicPr>
                   <pic:blipFill>
-                    <a:blip r:embed="rId6">
+                    <a:blip r:embed="rId8">
                       <a:extLst>
                         <a:ext uri="{28A0092B-C50C-407E-A947-70E740481C1C}">
                           <a14:useLocalDpi xmlns:a14="http://schemas.microsoft.com/office/drawing/2010/main" val="0"/>
@@ -5958,7 +5958,7 @@
                     <pic:cNvPicPr/>
                   </pic:nvPicPr>
                   <pic:blipFill>
-                    <a:blip r:embed="rId7">
+                    <a:blip r:embed="rId9">
                       <a:extLst>
                         <a:ext uri="{28A0092B-C50C-407E-A947-70E740481C1C}">
                           <a14:useLocalDpi xmlns:a14="http://schemas.microsoft.com/office/drawing/2010/main" val="0"/>
@@ -5993,34 +5993,2174 @@
     </w:p>
     <w:p>
       <w:pPr>
-        <w:spacing w:after="0"/>
-      </w:pPr>
-    </w:p>
-    <w:p>
-      <w:pPr>
-        <w:spacing w:after="0"/>
-      </w:pPr>
-    </w:p>
-    <w:p>
-      <w:pPr>
-        <w:spacing w:after="0"/>
-      </w:pPr>
-    </w:p>
-    <w:p>
-      <w:pPr>
-        <w:spacing w:after="0"/>
-      </w:pPr>
-    </w:p>
-    <w:p>
-      <w:pPr>
-        <w:spacing w:after="0"/>
-      </w:pPr>
-    </w:p>
-    <w:p>
-      <w:pPr>
-        <w:spacing w:after="0"/>
-      </w:pPr>
-    </w:p>
+        <w:rPr>
+          <w:b/>
+          <w:bCs/>
+        </w:rPr>
+      </w:pPr>
+      <w:r>
+        <w:rPr>
+          <w:b/>
+          <w:bCs/>
+        </w:rPr>
+        <w:lastRenderedPageBreak/>
+        <w:t>1. Risk Identification</w:t>
+      </w:r>
+    </w:p>
+    <w:p>
+      <w:r>
+        <w:t>These are the risks I found for the Smart Parking Platform, grouped by the four categories from class. The IDs carry over into the risk register in the next section.</w:t>
+      </w:r>
+    </w:p>
+    <w:p>
+      <w:pPr>
+        <w:rPr>
+          <w:b/>
+          <w:bCs/>
+        </w:rPr>
+      </w:pPr>
+      <w:r>
+        <w:rPr>
+          <w:b/>
+          <w:bCs/>
+        </w:rPr>
+        <w:t>Technical</w:t>
+      </w:r>
+    </w:p>
+    <w:p>
+      <w:r>
+        <w:t>T1: Operator occupancy feeds come in different formats, and some garages only send updates every few minutes. That would break NFR2, which requires availability to update within 5 seconds.</w:t>
+      </w:r>
+    </w:p>
+    <w:p>
+      <w:r>
+        <w:t>T2: GPS loses signal inside multi-level concrete garages, so the arrival check-in and the navigation handoff (FR8) may stop working once the driver is inside.</w:t>
+      </w:r>
+    </w:p>
+    <w:p>
+      <w:r>
+        <w:t>T3: Two drivers could book the last open spot at the same moment, especially during event traffic near NRG Stadium or Toyota Center.</w:t>
+      </w:r>
+    </w:p>
+    <w:p>
+      <w:r>
+        <w:t>T4: A release could reach some servers but not others, leaving old reservation logic running next to the new version. This is the same kind of failure behind the Knight Capital case from class.</w:t>
+      </w:r>
+    </w:p>
+    <w:p/>
+    <w:p>
+      <w:pPr>
+        <w:rPr>
+          <w:b/>
+          <w:bCs/>
+        </w:rPr>
+      </w:pPr>
+      <w:r>
+        <w:rPr>
+          <w:b/>
+          <w:bCs/>
+        </w:rPr>
+        <w:t>Schedule</w:t>
+      </w:r>
+    </w:p>
+    <w:p>
+      <w:r>
+        <w:t>S1: The project starts August 24, in the middle of hurricane season. A storm or a long power outage in Houston, like Beryl in 2024, could cost a full sprint.</w:t>
+      </w:r>
+    </w:p>
+    <w:p>
+      <w:r>
+        <w:t>S2: App Store review can take several days and can reject a build on the first try. The launch window is only November 30 to December 13, which leaves little room for a resubmission.</w:t>
+      </w:r>
+    </w:p>
+    <w:p>
+      <w:r>
+        <w:t>S3: Thanksgiving week (November 23 to 27) falls inside the testing window (November 9 to 29), which makes it hard to get user testers.</w:t>
+      </w:r>
+    </w:p>
+    <w:p>
+      <w:r>
+        <w:t>S4: Database &amp; Accounts (August 24 to September 13) is on the critical path. If it slips a week, almost every task after it slips too.</w:t>
+      </w:r>
+    </w:p>
+    <w:p/>
+    <w:p>
+      <w:pPr>
+        <w:rPr>
+          <w:b/>
+          <w:bCs/>
+        </w:rPr>
+      </w:pPr>
+      <w:r>
+        <w:rPr>
+          <w:b/>
+          <w:bCs/>
+        </w:rPr>
+        <w:t>Financial</w:t>
+      </w:r>
+    </w:p>
+    <w:p>
+      <w:r>
+        <w:t>F1: Mapping API charges are based on usage. Destination search with autocomplete can send a request on nearly every keystroke, so costs could jump once real users are on the app.</w:t>
+      </w:r>
+    </w:p>
+    <w:p>
+      <w:r>
+        <w:lastRenderedPageBreak/>
+        <w:t>F2: Card processing fees are a percentage plus a flat fee per transaction. On a short, cheap booking, like a $4 hour, the fee takes a big piece of the revenue.</w:t>
+      </w:r>
+    </w:p>
+    <w:p>
+      <w:r>
+        <w:t>F3: If card numbers pass through our own servers, the whole backend falls under PCI-DSS audit scope (NFR4), which is expensive to maintain.</w:t>
+      </w:r>
+    </w:p>
+    <w:p>
+      <w:r>
+        <w:t>F4: Refunds from cancellations (FR7) and chargebacks usually don't return the processing fee, so each one is a small loss.</w:t>
+      </w:r>
+    </w:p>
+    <w:p/>
+    <w:p>
+      <w:pPr>
+        <w:rPr>
+          <w:b/>
+          <w:bCs/>
+        </w:rPr>
+      </w:pPr>
+      <w:r>
+        <w:rPr>
+          <w:b/>
+          <w:bCs/>
+        </w:rPr>
+        <w:t>People</w:t>
+      </w:r>
+    </w:p>
+    <w:p>
+      <w:r>
+        <w:t>P1: The team is made up of full-time students. Midterms land during Reserve &amp; Pay (October 12 to November 1), and finals overlap the December launch.</w:t>
+      </w:r>
+      <w:r>
+        <w:t xml:space="preserve"> </w:t>
+      </w:r>
+    </w:p>
+    <w:p>
+      <w:r>
+        <w:t>P2: Only one person knows how the payment integration is set up. If they drop the class or leave the team, nobody else can finish it.</w:t>
+      </w:r>
+    </w:p>
+    <w:p>
+      <w:r>
+        <w:t>P3: Operators may ask for features outside our scope, like enforcement or ticketing tools, which the Vision and Scope section rules out.</w:t>
+      </w:r>
+    </w:p>
+    <w:p>
+      <w:r>
+        <w:t xml:space="preserve">P4: User testing depends on one pilot operator's staff. If that contact stops responding, testing at a live facility </w:t>
+      </w:r>
+      <w:proofErr w:type="gramStart"/>
+      <w:r>
+        <w:t>stalls</w:t>
+      </w:r>
+      <w:proofErr w:type="gramEnd"/>
+      <w:r>
+        <w:t>.</w:t>
+      </w:r>
+    </w:p>
+    <w:p/>
+    <w:p/>
+    <w:p/>
+    <w:p/>
+    <w:p/>
+    <w:p/>
+    <w:p/>
+    <w:p/>
+    <w:p/>
+    <w:p/>
+    <w:p/>
+    <w:p/>
+    <w:p>
+      <w:pPr>
+        <w:rPr>
+          <w:b/>
+          <w:bCs/>
+        </w:rPr>
+      </w:pPr>
+      <w:r>
+        <w:rPr>
+          <w:b/>
+          <w:bCs/>
+        </w:rPr>
+        <w:lastRenderedPageBreak/>
+        <w:t>2. Risk Register</w:t>
+      </w:r>
+    </w:p>
+    <w:p>
+      <w:pPr>
+        <w:keepNext/>
+      </w:pPr>
+      <w:r>
+        <w:t>Probability and impact use the 1 to 5 scales from the class risk matrix. The rating is where</w:t>
+      </w:r>
+    </w:p>
+    <w:p>
+      <w:pPr>
+        <w:keepNext/>
+      </w:pPr>
+      <w:r>
+        <w:t>the two meet on that matrix.</w:t>
+      </w:r>
+    </w:p>
+    <w:p/>
+    <w:tbl>
+      <w:tblPr>
+        <w:tblpPr w:leftFromText="180" w:rightFromText="180" w:vertAnchor="text" w:horzAnchor="page" w:tblpX="193" w:tblpY="-1019"/>
+        <w:tblW w:w="11875" w:type="dxa"/>
+        <w:tblBorders>
+          <w:top w:val="single" w:sz="4" w:space="0" w:color="A6A6A6"/>
+          <w:left w:val="single" w:sz="4" w:space="0" w:color="A6A6A6"/>
+          <w:bottom w:val="single" w:sz="4" w:space="0" w:color="A6A6A6"/>
+          <w:right w:val="single" w:sz="4" w:space="0" w:color="A6A6A6"/>
+          <w:insideH w:val="single" w:sz="4" w:space="0" w:color="A6A6A6"/>
+          <w:insideV w:val="single" w:sz="4" w:space="0" w:color="A6A6A6"/>
+        </w:tblBorders>
+        <w:tblLayout w:type="fixed"/>
+        <w:tblCellMar>
+          <w:top w:w="40" w:type="dxa"/>
+          <w:left w:w="70" w:type="dxa"/>
+          <w:bottom w:w="40" w:type="dxa"/>
+          <w:right w:w="70" w:type="dxa"/>
+        </w:tblCellMar>
+        <w:tblLook w:val="04A0" w:firstRow="1" w:lastRow="0" w:firstColumn="1" w:lastColumn="0" w:noHBand="0" w:noVBand="1"/>
+      </w:tblPr>
+      <w:tblGrid>
+        <w:gridCol w:w="1162"/>
+        <w:gridCol w:w="2185"/>
+        <w:gridCol w:w="1180"/>
+        <w:gridCol w:w="1267"/>
+        <w:gridCol w:w="786"/>
+        <w:gridCol w:w="1136"/>
+        <w:gridCol w:w="2579"/>
+        <w:gridCol w:w="1580"/>
+      </w:tblGrid>
+      <w:tr>
+        <w:trPr>
+          <w:cantSplit/>
+          <w:trHeight w:val="194"/>
+          <w:tblHeader/>
+        </w:trPr>
+        <w:tc>
+          <w:tcPr>
+            <w:tcW w:w="1162" w:type="dxa"/>
+            <w:shd w:val="clear" w:color="auto" w:fill="1F4E79"/>
+          </w:tcPr>
+          <w:p>
+            <w:pPr>
+              <w:spacing w:after="0" w:line="240" w:lineRule="auto"/>
+            </w:pPr>
+            <w:r>
+              <w:rPr>
+                <w:b/>
+                <w:bCs/>
+                <w:color w:val="FFFFFF"/>
+                <w:sz w:val="18"/>
+                <w:szCs w:val="18"/>
+              </w:rPr>
+              <w:lastRenderedPageBreak/>
+              <w:t>ID</w:t>
+            </w:r>
+          </w:p>
+        </w:tc>
+        <w:tc>
+          <w:tcPr>
+            <w:tcW w:w="2185" w:type="dxa"/>
+            <w:shd w:val="clear" w:color="auto" w:fill="1F4E79"/>
+          </w:tcPr>
+          <w:p>
+            <w:pPr>
+              <w:spacing w:after="0" w:line="240" w:lineRule="auto"/>
+            </w:pPr>
+            <w:r>
+              <w:rPr>
+                <w:b/>
+                <w:bCs/>
+                <w:color w:val="FFFFFF"/>
+                <w:sz w:val="18"/>
+                <w:szCs w:val="18"/>
+              </w:rPr>
+              <w:t>Risk</w:t>
+            </w:r>
+          </w:p>
+        </w:tc>
+        <w:tc>
+          <w:tcPr>
+            <w:tcW w:w="1180" w:type="dxa"/>
+            <w:shd w:val="clear" w:color="auto" w:fill="1F4E79"/>
+          </w:tcPr>
+          <w:p>
+            <w:pPr>
+              <w:spacing w:after="0" w:line="240" w:lineRule="auto"/>
+            </w:pPr>
+            <w:r>
+              <w:rPr>
+                <w:b/>
+                <w:bCs/>
+                <w:color w:val="FFFFFF"/>
+                <w:sz w:val="18"/>
+                <w:szCs w:val="18"/>
+              </w:rPr>
+              <w:t>Probability</w:t>
+            </w:r>
+          </w:p>
+        </w:tc>
+        <w:tc>
+          <w:tcPr>
+            <w:tcW w:w="1267" w:type="dxa"/>
+            <w:shd w:val="clear" w:color="auto" w:fill="1F4E79"/>
+          </w:tcPr>
+          <w:p>
+            <w:pPr>
+              <w:spacing w:after="0" w:line="240" w:lineRule="auto"/>
+            </w:pPr>
+            <w:r>
+              <w:rPr>
+                <w:b/>
+                <w:bCs/>
+                <w:color w:val="FFFFFF"/>
+                <w:sz w:val="18"/>
+                <w:szCs w:val="18"/>
+              </w:rPr>
+              <w:t>Impact</w:t>
+            </w:r>
+          </w:p>
+        </w:tc>
+        <w:tc>
+          <w:tcPr>
+            <w:tcW w:w="786" w:type="dxa"/>
+            <w:shd w:val="clear" w:color="auto" w:fill="1F4E79"/>
+          </w:tcPr>
+          <w:p>
+            <w:pPr>
+              <w:spacing w:after="0" w:line="240" w:lineRule="auto"/>
+            </w:pPr>
+            <w:r>
+              <w:rPr>
+                <w:b/>
+                <w:bCs/>
+                <w:color w:val="FFFFFF"/>
+                <w:sz w:val="18"/>
+                <w:szCs w:val="18"/>
+              </w:rPr>
+              <w:t>Rating</w:t>
+            </w:r>
+          </w:p>
+        </w:tc>
+        <w:tc>
+          <w:tcPr>
+            <w:tcW w:w="1136" w:type="dxa"/>
+            <w:shd w:val="clear" w:color="auto" w:fill="1F4E79"/>
+          </w:tcPr>
+          <w:p>
+            <w:pPr>
+              <w:spacing w:after="0" w:line="240" w:lineRule="auto"/>
+            </w:pPr>
+            <w:r>
+              <w:rPr>
+                <w:b/>
+                <w:bCs/>
+                <w:color w:val="FFFFFF"/>
+                <w:sz w:val="18"/>
+                <w:szCs w:val="18"/>
+              </w:rPr>
+              <w:t>Owner</w:t>
+            </w:r>
+          </w:p>
+        </w:tc>
+        <w:tc>
+          <w:tcPr>
+            <w:tcW w:w="2579" w:type="dxa"/>
+            <w:shd w:val="clear" w:color="auto" w:fill="1F4E79"/>
+          </w:tcPr>
+          <w:p>
+            <w:pPr>
+              <w:spacing w:after="0" w:line="240" w:lineRule="auto"/>
+            </w:pPr>
+            <w:r>
+              <w:rPr>
+                <w:b/>
+                <w:bCs/>
+                <w:color w:val="FFFFFF"/>
+                <w:sz w:val="18"/>
+                <w:szCs w:val="18"/>
+              </w:rPr>
+              <w:t>Response Strategy</w:t>
+            </w:r>
+          </w:p>
+        </w:tc>
+        <w:tc>
+          <w:tcPr>
+            <w:tcW w:w="1580" w:type="dxa"/>
+            <w:shd w:val="clear" w:color="auto" w:fill="1F4E79"/>
+          </w:tcPr>
+          <w:p>
+            <w:pPr>
+              <w:spacing w:after="0" w:line="240" w:lineRule="auto"/>
+            </w:pPr>
+            <w:r>
+              <w:rPr>
+                <w:b/>
+                <w:bCs/>
+                <w:color w:val="FFFFFF"/>
+                <w:sz w:val="18"/>
+                <w:szCs w:val="18"/>
+              </w:rPr>
+              <w:t>Status / Notes</w:t>
+            </w:r>
+          </w:p>
+        </w:tc>
+      </w:tr>
+      <w:tr>
+        <w:trPr>
+          <w:cantSplit/>
+          <w:trHeight w:val="591"/>
+        </w:trPr>
+        <w:tc>
+          <w:tcPr>
+            <w:tcW w:w="1162" w:type="dxa"/>
+          </w:tcPr>
+          <w:p>
+            <w:pPr>
+              <w:spacing w:after="0" w:line="240" w:lineRule="auto"/>
+            </w:pPr>
+            <w:r>
+              <w:rPr>
+                <w:b/>
+                <w:bCs/>
+                <w:sz w:val="18"/>
+                <w:szCs w:val="18"/>
+              </w:rPr>
+              <w:t>T1</w:t>
+            </w:r>
+          </w:p>
+        </w:tc>
+        <w:tc>
+          <w:tcPr>
+            <w:tcW w:w="2185" w:type="dxa"/>
+          </w:tcPr>
+          <w:p>
+            <w:pPr>
+              <w:spacing w:after="0" w:line="240" w:lineRule="auto"/>
+            </w:pPr>
+            <w:r>
+              <w:rPr>
+                <w:sz w:val="18"/>
+                <w:szCs w:val="18"/>
+              </w:rPr>
+              <w:t>Operator feeds too slow or inconsistent to meet the 5-second update (NFR2)</w:t>
+            </w:r>
+          </w:p>
+        </w:tc>
+        <w:tc>
+          <w:tcPr>
+            <w:tcW w:w="1180" w:type="dxa"/>
+          </w:tcPr>
+          <w:p>
+            <w:pPr>
+              <w:spacing w:after="0" w:line="240" w:lineRule="auto"/>
+            </w:pPr>
+            <w:r>
+              <w:rPr>
+                <w:sz w:val="18"/>
+                <w:szCs w:val="18"/>
+              </w:rPr>
+              <w:t>4 (High)</w:t>
+            </w:r>
+          </w:p>
+        </w:tc>
+        <w:tc>
+          <w:tcPr>
+            <w:tcW w:w="1267" w:type="dxa"/>
+          </w:tcPr>
+          <w:p>
+            <w:pPr>
+              <w:spacing w:after="0" w:line="240" w:lineRule="auto"/>
+            </w:pPr>
+            <w:r>
+              <w:rPr>
+                <w:sz w:val="18"/>
+                <w:szCs w:val="18"/>
+              </w:rPr>
+              <w:t>3 (Moderate)</w:t>
+            </w:r>
+          </w:p>
+        </w:tc>
+        <w:tc>
+          <w:tcPr>
+            <w:tcW w:w="786" w:type="dxa"/>
+            <w:shd w:val="clear" w:color="auto" w:fill="F4CCCC"/>
+          </w:tcPr>
+          <w:p>
+            <w:pPr>
+              <w:spacing w:after="0" w:line="240" w:lineRule="auto"/>
+            </w:pPr>
+            <w:r>
+              <w:rPr>
+                <w:sz w:val="18"/>
+                <w:szCs w:val="18"/>
+              </w:rPr>
+              <w:t>HIGH</w:t>
+            </w:r>
+          </w:p>
+        </w:tc>
+        <w:tc>
+          <w:tcPr>
+            <w:tcW w:w="1136" w:type="dxa"/>
+          </w:tcPr>
+          <w:p>
+            <w:pPr>
+              <w:spacing w:after="0" w:line="240" w:lineRule="auto"/>
+            </w:pPr>
+            <w:r>
+              <w:rPr>
+                <w:sz w:val="18"/>
+                <w:szCs w:val="18"/>
+              </w:rPr>
+              <w:t>Backend Lead</w:t>
+            </w:r>
+          </w:p>
+        </w:tc>
+        <w:tc>
+          <w:tcPr>
+            <w:tcW w:w="2579" w:type="dxa"/>
+          </w:tcPr>
+          <w:p>
+            <w:pPr>
+              <w:spacing w:after="0" w:line="240" w:lineRule="auto"/>
+            </w:pPr>
+            <w:r>
+              <w:rPr>
+                <w:sz w:val="18"/>
+                <w:szCs w:val="18"/>
+              </w:rPr>
+              <w:t>Mitigate: convert every feed to one format and show a "last updated" time on facilities with slow feeds</w:t>
+            </w:r>
+          </w:p>
+        </w:tc>
+        <w:tc>
+          <w:tcPr>
+            <w:tcW w:w="1580" w:type="dxa"/>
+          </w:tcPr>
+          <w:p>
+            <w:pPr>
+              <w:spacing w:after="0" w:line="240" w:lineRule="auto"/>
+            </w:pPr>
+            <w:r>
+              <w:rPr>
+                <w:sz w:val="18"/>
+                <w:szCs w:val="18"/>
+              </w:rPr>
+              <w:t>In progress. Part of the Availability Service work (Sep 21 to Oct 4).</w:t>
+            </w:r>
+          </w:p>
+        </w:tc>
+      </w:tr>
+      <w:tr>
+        <w:trPr>
+          <w:cantSplit/>
+          <w:trHeight w:val="777"/>
+        </w:trPr>
+        <w:tc>
+          <w:tcPr>
+            <w:tcW w:w="1162" w:type="dxa"/>
+          </w:tcPr>
+          <w:p>
+            <w:pPr>
+              <w:spacing w:after="0" w:line="240" w:lineRule="auto"/>
+            </w:pPr>
+            <w:r>
+              <w:rPr>
+                <w:b/>
+                <w:bCs/>
+                <w:sz w:val="18"/>
+                <w:szCs w:val="18"/>
+              </w:rPr>
+              <w:t>T3</w:t>
+            </w:r>
+          </w:p>
+        </w:tc>
+        <w:tc>
+          <w:tcPr>
+            <w:tcW w:w="2185" w:type="dxa"/>
+          </w:tcPr>
+          <w:p>
+            <w:pPr>
+              <w:spacing w:after="0" w:line="240" w:lineRule="auto"/>
+            </w:pPr>
+            <w:r>
+              <w:rPr>
+                <w:sz w:val="18"/>
+                <w:szCs w:val="18"/>
+              </w:rPr>
+              <w:t>Two drivers book the last open spot at the same time</w:t>
+            </w:r>
+          </w:p>
+        </w:tc>
+        <w:tc>
+          <w:tcPr>
+            <w:tcW w:w="1180" w:type="dxa"/>
+          </w:tcPr>
+          <w:p>
+            <w:pPr>
+              <w:spacing w:after="0" w:line="240" w:lineRule="auto"/>
+            </w:pPr>
+            <w:r>
+              <w:rPr>
+                <w:sz w:val="18"/>
+                <w:szCs w:val="18"/>
+              </w:rPr>
+              <w:t>3 (Moderate)</w:t>
+            </w:r>
+          </w:p>
+        </w:tc>
+        <w:tc>
+          <w:tcPr>
+            <w:tcW w:w="1267" w:type="dxa"/>
+          </w:tcPr>
+          <w:p>
+            <w:pPr>
+              <w:spacing w:after="0" w:line="240" w:lineRule="auto"/>
+            </w:pPr>
+            <w:r>
+              <w:rPr>
+                <w:sz w:val="18"/>
+                <w:szCs w:val="18"/>
+              </w:rPr>
+              <w:t>4 (Major)</w:t>
+            </w:r>
+          </w:p>
+        </w:tc>
+        <w:tc>
+          <w:tcPr>
+            <w:tcW w:w="786" w:type="dxa"/>
+            <w:shd w:val="clear" w:color="auto" w:fill="F4CCCC"/>
+          </w:tcPr>
+          <w:p>
+            <w:pPr>
+              <w:spacing w:after="0" w:line="240" w:lineRule="auto"/>
+            </w:pPr>
+            <w:r>
+              <w:rPr>
+                <w:sz w:val="18"/>
+                <w:szCs w:val="18"/>
+              </w:rPr>
+              <w:t>HIGH</w:t>
+            </w:r>
+          </w:p>
+        </w:tc>
+        <w:tc>
+          <w:tcPr>
+            <w:tcW w:w="1136" w:type="dxa"/>
+          </w:tcPr>
+          <w:p>
+            <w:pPr>
+              <w:spacing w:after="0" w:line="240" w:lineRule="auto"/>
+            </w:pPr>
+            <w:r>
+              <w:rPr>
+                <w:sz w:val="18"/>
+                <w:szCs w:val="18"/>
+              </w:rPr>
+              <w:t>Backend Lead</w:t>
+            </w:r>
+          </w:p>
+        </w:tc>
+        <w:tc>
+          <w:tcPr>
+            <w:tcW w:w="2579" w:type="dxa"/>
+          </w:tcPr>
+          <w:p>
+            <w:pPr>
+              <w:spacing w:after="0" w:line="240" w:lineRule="auto"/>
+            </w:pPr>
+            <w:r>
+              <w:rPr>
+                <w:sz w:val="18"/>
+                <w:szCs w:val="18"/>
+              </w:rPr>
+              <w:t>Mitigate: hold the spot during checkout and lock it in the database; include it in the 1,000-user load test (NFR1)</w:t>
+            </w:r>
+          </w:p>
+        </w:tc>
+        <w:tc>
+          <w:tcPr>
+            <w:tcW w:w="1580" w:type="dxa"/>
+          </w:tcPr>
+          <w:p>
+            <w:pPr>
+              <w:spacing w:after="0" w:line="240" w:lineRule="auto"/>
+            </w:pPr>
+            <w:r>
+              <w:rPr>
+                <w:sz w:val="18"/>
+                <w:szCs w:val="18"/>
+              </w:rPr>
+              <w:t>Open. Test planned for the November testing window.</w:t>
+            </w:r>
+          </w:p>
+        </w:tc>
+      </w:tr>
+      <w:tr>
+        <w:trPr>
+          <w:cantSplit/>
+          <w:trHeight w:val="786"/>
+        </w:trPr>
+        <w:tc>
+          <w:tcPr>
+            <w:tcW w:w="1162" w:type="dxa"/>
+          </w:tcPr>
+          <w:p>
+            <w:pPr>
+              <w:spacing w:after="0" w:line="240" w:lineRule="auto"/>
+            </w:pPr>
+            <w:r>
+              <w:rPr>
+                <w:b/>
+                <w:bCs/>
+                <w:sz w:val="18"/>
+                <w:szCs w:val="18"/>
+              </w:rPr>
+              <w:t>T4</w:t>
+            </w:r>
+          </w:p>
+        </w:tc>
+        <w:tc>
+          <w:tcPr>
+            <w:tcW w:w="2185" w:type="dxa"/>
+          </w:tcPr>
+          <w:p>
+            <w:pPr>
+              <w:spacing w:after="0" w:line="240" w:lineRule="auto"/>
+            </w:pPr>
+            <w:r>
+              <w:rPr>
+                <w:sz w:val="18"/>
+                <w:szCs w:val="18"/>
+              </w:rPr>
+              <w:t>Release reaches some servers but not others</w:t>
+            </w:r>
+          </w:p>
+        </w:tc>
+        <w:tc>
+          <w:tcPr>
+            <w:tcW w:w="1180" w:type="dxa"/>
+          </w:tcPr>
+          <w:p>
+            <w:pPr>
+              <w:spacing w:after="0" w:line="240" w:lineRule="auto"/>
+            </w:pPr>
+            <w:r>
+              <w:rPr>
+                <w:sz w:val="18"/>
+                <w:szCs w:val="18"/>
+              </w:rPr>
+              <w:t>2 (Low)</w:t>
+            </w:r>
+          </w:p>
+        </w:tc>
+        <w:tc>
+          <w:tcPr>
+            <w:tcW w:w="1267" w:type="dxa"/>
+          </w:tcPr>
+          <w:p>
+            <w:pPr>
+              <w:spacing w:after="0" w:line="240" w:lineRule="auto"/>
+            </w:pPr>
+            <w:r>
+              <w:rPr>
+                <w:sz w:val="18"/>
+                <w:szCs w:val="18"/>
+              </w:rPr>
+              <w:t>5 (Catastrophic)</w:t>
+            </w:r>
+          </w:p>
+        </w:tc>
+        <w:tc>
+          <w:tcPr>
+            <w:tcW w:w="786" w:type="dxa"/>
+            <w:shd w:val="clear" w:color="auto" w:fill="F4CCCC"/>
+          </w:tcPr>
+          <w:p>
+            <w:pPr>
+              <w:spacing w:after="0" w:line="240" w:lineRule="auto"/>
+            </w:pPr>
+            <w:r>
+              <w:rPr>
+                <w:sz w:val="18"/>
+                <w:szCs w:val="18"/>
+              </w:rPr>
+              <w:t>HIGH</w:t>
+            </w:r>
+          </w:p>
+        </w:tc>
+        <w:tc>
+          <w:tcPr>
+            <w:tcW w:w="1136" w:type="dxa"/>
+          </w:tcPr>
+          <w:p>
+            <w:pPr>
+              <w:spacing w:after="0" w:line="240" w:lineRule="auto"/>
+            </w:pPr>
+            <w:r>
+              <w:rPr>
+                <w:sz w:val="18"/>
+                <w:szCs w:val="18"/>
+              </w:rPr>
+              <w:t>Backend Lead</w:t>
+            </w:r>
+          </w:p>
+        </w:tc>
+        <w:tc>
+          <w:tcPr>
+            <w:tcW w:w="2579" w:type="dxa"/>
+          </w:tcPr>
+          <w:p>
+            <w:pPr>
+              <w:spacing w:after="0" w:line="240" w:lineRule="auto"/>
+            </w:pPr>
+            <w:r>
+              <w:rPr>
+                <w:sz w:val="18"/>
+                <w:szCs w:val="18"/>
+              </w:rPr>
+              <w:t>Mitigate: deploy to staging first, release to all servers at once, keep a written rollback plan, and remove old unused code</w:t>
+            </w:r>
+          </w:p>
+        </w:tc>
+        <w:tc>
+          <w:tcPr>
+            <w:tcW w:w="1580" w:type="dxa"/>
+          </w:tcPr>
+          <w:p>
+            <w:pPr>
+              <w:spacing w:after="0" w:line="240" w:lineRule="auto"/>
+            </w:pPr>
+            <w:r>
+              <w:rPr>
+                <w:sz w:val="18"/>
+                <w:szCs w:val="18"/>
+              </w:rPr>
+              <w:t>Open. Rollback plan due before launch.</w:t>
+            </w:r>
+          </w:p>
+        </w:tc>
+      </w:tr>
+      <w:tr>
+        <w:trPr>
+          <w:cantSplit/>
+          <w:trHeight w:val="777"/>
+        </w:trPr>
+        <w:tc>
+          <w:tcPr>
+            <w:tcW w:w="1162" w:type="dxa"/>
+          </w:tcPr>
+          <w:p>
+            <w:pPr>
+              <w:spacing w:after="0" w:line="240" w:lineRule="auto"/>
+            </w:pPr>
+            <w:r>
+              <w:rPr>
+                <w:b/>
+                <w:bCs/>
+                <w:sz w:val="18"/>
+                <w:szCs w:val="18"/>
+              </w:rPr>
+              <w:t>S1</w:t>
+            </w:r>
+          </w:p>
+        </w:tc>
+        <w:tc>
+          <w:tcPr>
+            <w:tcW w:w="2185" w:type="dxa"/>
+          </w:tcPr>
+          <w:p>
+            <w:pPr>
+              <w:spacing w:after="0" w:line="240" w:lineRule="auto"/>
+            </w:pPr>
+            <w:r>
+              <w:rPr>
+                <w:sz w:val="18"/>
+                <w:szCs w:val="18"/>
+              </w:rPr>
+              <w:t>Hurricane or long power outage during peak season</w:t>
+            </w:r>
+          </w:p>
+        </w:tc>
+        <w:tc>
+          <w:tcPr>
+            <w:tcW w:w="1180" w:type="dxa"/>
+          </w:tcPr>
+          <w:p>
+            <w:pPr>
+              <w:spacing w:after="0" w:line="240" w:lineRule="auto"/>
+            </w:pPr>
+            <w:r>
+              <w:rPr>
+                <w:sz w:val="18"/>
+                <w:szCs w:val="18"/>
+              </w:rPr>
+              <w:t>3 (Moderate)</w:t>
+            </w:r>
+          </w:p>
+        </w:tc>
+        <w:tc>
+          <w:tcPr>
+            <w:tcW w:w="1267" w:type="dxa"/>
+          </w:tcPr>
+          <w:p>
+            <w:pPr>
+              <w:spacing w:after="0" w:line="240" w:lineRule="auto"/>
+            </w:pPr>
+            <w:r>
+              <w:rPr>
+                <w:sz w:val="18"/>
+                <w:szCs w:val="18"/>
+              </w:rPr>
+              <w:t>4 (Major)</w:t>
+            </w:r>
+          </w:p>
+        </w:tc>
+        <w:tc>
+          <w:tcPr>
+            <w:tcW w:w="786" w:type="dxa"/>
+            <w:shd w:val="clear" w:color="auto" w:fill="F4CCCC"/>
+          </w:tcPr>
+          <w:p>
+            <w:pPr>
+              <w:spacing w:after="0" w:line="240" w:lineRule="auto"/>
+            </w:pPr>
+            <w:r>
+              <w:rPr>
+                <w:sz w:val="18"/>
+                <w:szCs w:val="18"/>
+              </w:rPr>
+              <w:t>HIGH</w:t>
+            </w:r>
+          </w:p>
+        </w:tc>
+        <w:tc>
+          <w:tcPr>
+            <w:tcW w:w="1136" w:type="dxa"/>
+          </w:tcPr>
+          <w:p>
+            <w:pPr>
+              <w:spacing w:after="0" w:line="240" w:lineRule="auto"/>
+            </w:pPr>
+            <w:r>
+              <w:rPr>
+                <w:sz w:val="18"/>
+                <w:szCs w:val="18"/>
+              </w:rPr>
+              <w:t>Project Manager</w:t>
+            </w:r>
+          </w:p>
+        </w:tc>
+        <w:tc>
+          <w:tcPr>
+            <w:tcW w:w="2579" w:type="dxa"/>
+          </w:tcPr>
+          <w:p>
+            <w:pPr>
+              <w:spacing w:after="0" w:line="240" w:lineRule="auto"/>
+            </w:pPr>
+            <w:r>
+              <w:rPr>
+                <w:sz w:val="18"/>
+                <w:szCs w:val="18"/>
+              </w:rPr>
+              <w:t>Mitigate: keep all work in GitHub and cloud tools so the team can keep going from anywhere with power</w:t>
+            </w:r>
+          </w:p>
+        </w:tc>
+        <w:tc>
+          <w:tcPr>
+            <w:tcW w:w="1580" w:type="dxa"/>
+          </w:tcPr>
+          <w:p>
+            <w:pPr>
+              <w:spacing w:after="0" w:line="240" w:lineRule="auto"/>
+            </w:pPr>
+            <w:r>
+              <w:rPr>
+                <w:sz w:val="18"/>
+                <w:szCs w:val="18"/>
+              </w:rPr>
+              <w:t>Monitoring until Nov 30, the end of hurricane season.</w:t>
+            </w:r>
+          </w:p>
+        </w:tc>
+      </w:tr>
+      <w:tr>
+        <w:trPr>
+          <w:cantSplit/>
+          <w:trHeight w:val="591"/>
+        </w:trPr>
+        <w:tc>
+          <w:tcPr>
+            <w:tcW w:w="1162" w:type="dxa"/>
+          </w:tcPr>
+          <w:p>
+            <w:pPr>
+              <w:spacing w:after="0" w:line="240" w:lineRule="auto"/>
+            </w:pPr>
+            <w:r>
+              <w:rPr>
+                <w:b/>
+                <w:bCs/>
+                <w:sz w:val="18"/>
+                <w:szCs w:val="18"/>
+              </w:rPr>
+              <w:t>S2</w:t>
+            </w:r>
+          </w:p>
+        </w:tc>
+        <w:tc>
+          <w:tcPr>
+            <w:tcW w:w="2185" w:type="dxa"/>
+          </w:tcPr>
+          <w:p>
+            <w:pPr>
+              <w:spacing w:after="0" w:line="240" w:lineRule="auto"/>
+            </w:pPr>
+            <w:r>
+              <w:rPr>
+                <w:sz w:val="18"/>
+                <w:szCs w:val="18"/>
+              </w:rPr>
+              <w:t>App Store review delays or rejects the launch build</w:t>
+            </w:r>
+          </w:p>
+        </w:tc>
+        <w:tc>
+          <w:tcPr>
+            <w:tcW w:w="1180" w:type="dxa"/>
+          </w:tcPr>
+          <w:p>
+            <w:pPr>
+              <w:spacing w:after="0" w:line="240" w:lineRule="auto"/>
+            </w:pPr>
+            <w:r>
+              <w:rPr>
+                <w:sz w:val="18"/>
+                <w:szCs w:val="18"/>
+              </w:rPr>
+              <w:t>3 (Moderate)</w:t>
+            </w:r>
+          </w:p>
+        </w:tc>
+        <w:tc>
+          <w:tcPr>
+            <w:tcW w:w="1267" w:type="dxa"/>
+          </w:tcPr>
+          <w:p>
+            <w:pPr>
+              <w:spacing w:after="0" w:line="240" w:lineRule="auto"/>
+            </w:pPr>
+            <w:r>
+              <w:rPr>
+                <w:sz w:val="18"/>
+                <w:szCs w:val="18"/>
+              </w:rPr>
+              <w:t>4 (Major)</w:t>
+            </w:r>
+          </w:p>
+        </w:tc>
+        <w:tc>
+          <w:tcPr>
+            <w:tcW w:w="786" w:type="dxa"/>
+            <w:shd w:val="clear" w:color="auto" w:fill="F4CCCC"/>
+          </w:tcPr>
+          <w:p>
+            <w:pPr>
+              <w:spacing w:after="0" w:line="240" w:lineRule="auto"/>
+            </w:pPr>
+            <w:r>
+              <w:rPr>
+                <w:sz w:val="18"/>
+                <w:szCs w:val="18"/>
+              </w:rPr>
+              <w:t>HIGH</w:t>
+            </w:r>
+          </w:p>
+        </w:tc>
+        <w:tc>
+          <w:tcPr>
+            <w:tcW w:w="1136" w:type="dxa"/>
+          </w:tcPr>
+          <w:p>
+            <w:pPr>
+              <w:spacing w:after="0" w:line="240" w:lineRule="auto"/>
+            </w:pPr>
+            <w:r>
+              <w:rPr>
+                <w:sz w:val="18"/>
+                <w:szCs w:val="18"/>
+              </w:rPr>
+              <w:t>Mobile Lead</w:t>
+            </w:r>
+          </w:p>
+        </w:tc>
+        <w:tc>
+          <w:tcPr>
+            <w:tcW w:w="2579" w:type="dxa"/>
+          </w:tcPr>
+          <w:p>
+            <w:pPr>
+              <w:spacing w:after="0" w:line="240" w:lineRule="auto"/>
+            </w:pPr>
+            <w:r>
+              <w:rPr>
+                <w:sz w:val="18"/>
+                <w:szCs w:val="18"/>
+              </w:rPr>
+              <w:t>Mitigate: submit a test build in mid-November so review problems show up before the launch window</w:t>
+            </w:r>
+          </w:p>
+        </w:tc>
+        <w:tc>
+          <w:tcPr>
+            <w:tcW w:w="1580" w:type="dxa"/>
+          </w:tcPr>
+          <w:p>
+            <w:pPr>
+              <w:spacing w:after="0" w:line="240" w:lineRule="auto"/>
+            </w:pPr>
+            <w:r>
+              <w:rPr>
+                <w:sz w:val="18"/>
+                <w:szCs w:val="18"/>
+              </w:rPr>
+              <w:t>Open.</w:t>
+            </w:r>
+          </w:p>
+        </w:tc>
+      </w:tr>
+      <w:tr>
+        <w:trPr>
+          <w:cantSplit/>
+          <w:trHeight w:val="388"/>
+        </w:trPr>
+        <w:tc>
+          <w:tcPr>
+            <w:tcW w:w="1162" w:type="dxa"/>
+          </w:tcPr>
+          <w:p>
+            <w:pPr>
+              <w:spacing w:after="0" w:line="240" w:lineRule="auto"/>
+            </w:pPr>
+            <w:r>
+              <w:rPr>
+                <w:b/>
+                <w:bCs/>
+                <w:sz w:val="18"/>
+                <w:szCs w:val="18"/>
+              </w:rPr>
+              <w:t>S3</w:t>
+            </w:r>
+          </w:p>
+        </w:tc>
+        <w:tc>
+          <w:tcPr>
+            <w:tcW w:w="2185" w:type="dxa"/>
+          </w:tcPr>
+          <w:p>
+            <w:pPr>
+              <w:spacing w:after="0" w:line="240" w:lineRule="auto"/>
+            </w:pPr>
+            <w:r>
+              <w:rPr>
+                <w:sz w:val="18"/>
+                <w:szCs w:val="18"/>
+              </w:rPr>
+              <w:t>Thanksgiving week cuts into user testing</w:t>
+            </w:r>
+          </w:p>
+        </w:tc>
+        <w:tc>
+          <w:tcPr>
+            <w:tcW w:w="1180" w:type="dxa"/>
+          </w:tcPr>
+          <w:p>
+            <w:pPr>
+              <w:spacing w:after="0" w:line="240" w:lineRule="auto"/>
+            </w:pPr>
+            <w:r>
+              <w:rPr>
+                <w:sz w:val="18"/>
+                <w:szCs w:val="18"/>
+              </w:rPr>
+              <w:t>4 (High)</w:t>
+            </w:r>
+          </w:p>
+        </w:tc>
+        <w:tc>
+          <w:tcPr>
+            <w:tcW w:w="1267" w:type="dxa"/>
+          </w:tcPr>
+          <w:p>
+            <w:pPr>
+              <w:spacing w:after="0" w:line="240" w:lineRule="auto"/>
+            </w:pPr>
+            <w:r>
+              <w:rPr>
+                <w:sz w:val="18"/>
+                <w:szCs w:val="18"/>
+              </w:rPr>
+              <w:t>2 (Minor)</w:t>
+            </w:r>
+          </w:p>
+        </w:tc>
+        <w:tc>
+          <w:tcPr>
+            <w:tcW w:w="786" w:type="dxa"/>
+            <w:shd w:val="clear" w:color="auto" w:fill="FFF2CC"/>
+          </w:tcPr>
+          <w:p>
+            <w:pPr>
+              <w:spacing w:after="0" w:line="240" w:lineRule="auto"/>
+            </w:pPr>
+            <w:r>
+              <w:rPr>
+                <w:sz w:val="18"/>
+                <w:szCs w:val="18"/>
+              </w:rPr>
+              <w:t>MEDIUM</w:t>
+            </w:r>
+          </w:p>
+        </w:tc>
+        <w:tc>
+          <w:tcPr>
+            <w:tcW w:w="1136" w:type="dxa"/>
+          </w:tcPr>
+          <w:p>
+            <w:pPr>
+              <w:spacing w:after="0" w:line="240" w:lineRule="auto"/>
+            </w:pPr>
+            <w:r>
+              <w:rPr>
+                <w:sz w:val="18"/>
+                <w:szCs w:val="18"/>
+              </w:rPr>
+              <w:t>QA Lead</w:t>
+            </w:r>
+          </w:p>
+        </w:tc>
+        <w:tc>
+          <w:tcPr>
+            <w:tcW w:w="2579" w:type="dxa"/>
+          </w:tcPr>
+          <w:p>
+            <w:pPr>
+              <w:spacing w:after="0" w:line="240" w:lineRule="auto"/>
+            </w:pPr>
+            <w:r>
+              <w:rPr>
+                <w:sz w:val="18"/>
+                <w:szCs w:val="18"/>
+              </w:rPr>
+              <w:t>Mitigate: schedule user testing sessions before Nov 20</w:t>
+            </w:r>
+          </w:p>
+        </w:tc>
+        <w:tc>
+          <w:tcPr>
+            <w:tcW w:w="1580" w:type="dxa"/>
+          </w:tcPr>
+          <w:p>
+            <w:pPr>
+              <w:spacing w:after="0" w:line="240" w:lineRule="auto"/>
+            </w:pPr>
+            <w:r>
+              <w:rPr>
+                <w:sz w:val="18"/>
+                <w:szCs w:val="18"/>
+              </w:rPr>
+              <w:t>Open.</w:t>
+            </w:r>
+          </w:p>
+        </w:tc>
+      </w:tr>
+      <w:tr>
+        <w:trPr>
+          <w:cantSplit/>
+          <w:trHeight w:val="591"/>
+        </w:trPr>
+        <w:tc>
+          <w:tcPr>
+            <w:tcW w:w="1162" w:type="dxa"/>
+          </w:tcPr>
+          <w:p>
+            <w:pPr>
+              <w:spacing w:after="0" w:line="240" w:lineRule="auto"/>
+            </w:pPr>
+            <w:r>
+              <w:rPr>
+                <w:b/>
+                <w:bCs/>
+                <w:sz w:val="18"/>
+                <w:szCs w:val="18"/>
+              </w:rPr>
+              <w:t>F1</w:t>
+            </w:r>
+          </w:p>
+        </w:tc>
+        <w:tc>
+          <w:tcPr>
+            <w:tcW w:w="2185" w:type="dxa"/>
+          </w:tcPr>
+          <w:p>
+            <w:pPr>
+              <w:spacing w:after="0" w:line="240" w:lineRule="auto"/>
+            </w:pPr>
+            <w:r>
+              <w:rPr>
+                <w:sz w:val="18"/>
+                <w:szCs w:val="18"/>
+              </w:rPr>
+              <w:t>Mapping API costs spike with real traffic</w:t>
+            </w:r>
+          </w:p>
+        </w:tc>
+        <w:tc>
+          <w:tcPr>
+            <w:tcW w:w="1180" w:type="dxa"/>
+          </w:tcPr>
+          <w:p>
+            <w:pPr>
+              <w:spacing w:after="0" w:line="240" w:lineRule="auto"/>
+            </w:pPr>
+            <w:r>
+              <w:rPr>
+                <w:sz w:val="18"/>
+                <w:szCs w:val="18"/>
+              </w:rPr>
+              <w:t>3 (Moderate)</w:t>
+            </w:r>
+          </w:p>
+        </w:tc>
+        <w:tc>
+          <w:tcPr>
+            <w:tcW w:w="1267" w:type="dxa"/>
+          </w:tcPr>
+          <w:p>
+            <w:pPr>
+              <w:spacing w:after="0" w:line="240" w:lineRule="auto"/>
+            </w:pPr>
+            <w:r>
+              <w:rPr>
+                <w:sz w:val="18"/>
+                <w:szCs w:val="18"/>
+              </w:rPr>
+              <w:t>3 (Moderate)</w:t>
+            </w:r>
+          </w:p>
+        </w:tc>
+        <w:tc>
+          <w:tcPr>
+            <w:tcW w:w="786" w:type="dxa"/>
+            <w:shd w:val="clear" w:color="auto" w:fill="FFF2CC"/>
+          </w:tcPr>
+          <w:p>
+            <w:pPr>
+              <w:spacing w:after="0" w:line="240" w:lineRule="auto"/>
+            </w:pPr>
+            <w:r>
+              <w:rPr>
+                <w:sz w:val="18"/>
+                <w:szCs w:val="18"/>
+              </w:rPr>
+              <w:t>MEDIUM</w:t>
+            </w:r>
+          </w:p>
+        </w:tc>
+        <w:tc>
+          <w:tcPr>
+            <w:tcW w:w="1136" w:type="dxa"/>
+          </w:tcPr>
+          <w:p>
+            <w:pPr>
+              <w:spacing w:after="0" w:line="240" w:lineRule="auto"/>
+            </w:pPr>
+            <w:r>
+              <w:rPr>
+                <w:sz w:val="18"/>
+                <w:szCs w:val="18"/>
+              </w:rPr>
+              <w:t>Backend Lead</w:t>
+            </w:r>
+          </w:p>
+        </w:tc>
+        <w:tc>
+          <w:tcPr>
+            <w:tcW w:w="2579" w:type="dxa"/>
+          </w:tcPr>
+          <w:p>
+            <w:pPr>
+              <w:spacing w:after="0" w:line="240" w:lineRule="auto"/>
+            </w:pPr>
+            <w:r>
+              <w:rPr>
+                <w:sz w:val="18"/>
+                <w:szCs w:val="18"/>
+              </w:rPr>
+              <w:t>Mitigate: search only after the user stops typing, cache results, and set budget alerts and daily caps</w:t>
+            </w:r>
+          </w:p>
+        </w:tc>
+        <w:tc>
+          <w:tcPr>
+            <w:tcW w:w="1580" w:type="dxa"/>
+          </w:tcPr>
+          <w:p>
+            <w:pPr>
+              <w:spacing w:after="0" w:line="240" w:lineRule="auto"/>
+            </w:pPr>
+            <w:r>
+              <w:rPr>
+                <w:sz w:val="18"/>
+                <w:szCs w:val="18"/>
+              </w:rPr>
+              <w:t>Open.</w:t>
+            </w:r>
+          </w:p>
+        </w:tc>
+      </w:tr>
+      <w:tr>
+        <w:trPr>
+          <w:cantSplit/>
+          <w:trHeight w:val="582"/>
+        </w:trPr>
+        <w:tc>
+          <w:tcPr>
+            <w:tcW w:w="1162" w:type="dxa"/>
+          </w:tcPr>
+          <w:p>
+            <w:pPr>
+              <w:spacing w:after="0" w:line="240" w:lineRule="auto"/>
+            </w:pPr>
+            <w:r>
+              <w:rPr>
+                <w:b/>
+                <w:bCs/>
+                <w:sz w:val="18"/>
+                <w:szCs w:val="18"/>
+              </w:rPr>
+              <w:t>F2</w:t>
+            </w:r>
+          </w:p>
+        </w:tc>
+        <w:tc>
+          <w:tcPr>
+            <w:tcW w:w="2185" w:type="dxa"/>
+          </w:tcPr>
+          <w:p>
+            <w:pPr>
+              <w:spacing w:after="0" w:line="240" w:lineRule="auto"/>
+            </w:pPr>
+            <w:r>
+              <w:rPr>
+                <w:sz w:val="18"/>
+                <w:szCs w:val="18"/>
+              </w:rPr>
+              <w:t>Card fees eat most of the revenue on cheap, short bookings</w:t>
+            </w:r>
+          </w:p>
+        </w:tc>
+        <w:tc>
+          <w:tcPr>
+            <w:tcW w:w="1180" w:type="dxa"/>
+          </w:tcPr>
+          <w:p>
+            <w:pPr>
+              <w:spacing w:after="0" w:line="240" w:lineRule="auto"/>
+            </w:pPr>
+            <w:r>
+              <w:rPr>
+                <w:sz w:val="18"/>
+                <w:szCs w:val="18"/>
+              </w:rPr>
+              <w:t>4 (High)</w:t>
+            </w:r>
+          </w:p>
+        </w:tc>
+        <w:tc>
+          <w:tcPr>
+            <w:tcW w:w="1267" w:type="dxa"/>
+          </w:tcPr>
+          <w:p>
+            <w:pPr>
+              <w:spacing w:after="0" w:line="240" w:lineRule="auto"/>
+            </w:pPr>
+            <w:r>
+              <w:rPr>
+                <w:sz w:val="18"/>
+                <w:szCs w:val="18"/>
+              </w:rPr>
+              <w:t>2 (Minor)</w:t>
+            </w:r>
+          </w:p>
+        </w:tc>
+        <w:tc>
+          <w:tcPr>
+            <w:tcW w:w="786" w:type="dxa"/>
+            <w:shd w:val="clear" w:color="auto" w:fill="FFF2CC"/>
+          </w:tcPr>
+          <w:p>
+            <w:pPr>
+              <w:spacing w:after="0" w:line="240" w:lineRule="auto"/>
+            </w:pPr>
+            <w:r>
+              <w:rPr>
+                <w:sz w:val="18"/>
+                <w:szCs w:val="18"/>
+              </w:rPr>
+              <w:t>MEDIUM</w:t>
+            </w:r>
+          </w:p>
+        </w:tc>
+        <w:tc>
+          <w:tcPr>
+            <w:tcW w:w="1136" w:type="dxa"/>
+          </w:tcPr>
+          <w:p>
+            <w:pPr>
+              <w:spacing w:after="0" w:line="240" w:lineRule="auto"/>
+            </w:pPr>
+            <w:r>
+              <w:rPr>
+                <w:sz w:val="18"/>
+                <w:szCs w:val="18"/>
+              </w:rPr>
+              <w:t>Finance/Billing</w:t>
+            </w:r>
+          </w:p>
+        </w:tc>
+        <w:tc>
+          <w:tcPr>
+            <w:tcW w:w="2579" w:type="dxa"/>
+          </w:tcPr>
+          <w:p>
+            <w:pPr>
+              <w:spacing w:after="0" w:line="240" w:lineRule="auto"/>
+            </w:pPr>
+            <w:r>
+              <w:rPr>
+                <w:sz w:val="18"/>
+                <w:szCs w:val="18"/>
+              </w:rPr>
+              <w:t>Mitigate: add a small booking fee or a minimum charge</w:t>
+            </w:r>
+          </w:p>
+        </w:tc>
+        <w:tc>
+          <w:tcPr>
+            <w:tcW w:w="1580" w:type="dxa"/>
+          </w:tcPr>
+          <w:p>
+            <w:pPr>
+              <w:spacing w:after="0" w:line="240" w:lineRule="auto"/>
+            </w:pPr>
+            <w:r>
+              <w:rPr>
+                <w:sz w:val="18"/>
+                <w:szCs w:val="18"/>
+              </w:rPr>
+              <w:t>Open. Decision needed before Reserve &amp; Pay starts Oct 12.</w:t>
+            </w:r>
+          </w:p>
+        </w:tc>
+      </w:tr>
+      <w:tr>
+        <w:trPr>
+          <w:cantSplit/>
+          <w:trHeight w:val="582"/>
+        </w:trPr>
+        <w:tc>
+          <w:tcPr>
+            <w:tcW w:w="1162" w:type="dxa"/>
+          </w:tcPr>
+          <w:p>
+            <w:pPr>
+              <w:spacing w:after="0" w:line="240" w:lineRule="auto"/>
+            </w:pPr>
+            <w:r>
+              <w:rPr>
+                <w:b/>
+                <w:bCs/>
+                <w:sz w:val="18"/>
+                <w:szCs w:val="18"/>
+              </w:rPr>
+              <w:t>F3</w:t>
+            </w:r>
+          </w:p>
+        </w:tc>
+        <w:tc>
+          <w:tcPr>
+            <w:tcW w:w="2185" w:type="dxa"/>
+          </w:tcPr>
+          <w:p>
+            <w:pPr>
+              <w:spacing w:after="0" w:line="240" w:lineRule="auto"/>
+            </w:pPr>
+            <w:r>
+              <w:rPr>
+                <w:sz w:val="18"/>
+                <w:szCs w:val="18"/>
+              </w:rPr>
+              <w:t>Handling card numbers puts the backend in PCI audit scope</w:t>
+            </w:r>
+          </w:p>
+        </w:tc>
+        <w:tc>
+          <w:tcPr>
+            <w:tcW w:w="1180" w:type="dxa"/>
+          </w:tcPr>
+          <w:p>
+            <w:pPr>
+              <w:spacing w:after="0" w:line="240" w:lineRule="auto"/>
+            </w:pPr>
+            <w:r>
+              <w:rPr>
+                <w:sz w:val="18"/>
+                <w:szCs w:val="18"/>
+              </w:rPr>
+              <w:t>2 (Low)</w:t>
+            </w:r>
+          </w:p>
+        </w:tc>
+        <w:tc>
+          <w:tcPr>
+            <w:tcW w:w="1267" w:type="dxa"/>
+          </w:tcPr>
+          <w:p>
+            <w:pPr>
+              <w:spacing w:after="0" w:line="240" w:lineRule="auto"/>
+            </w:pPr>
+            <w:r>
+              <w:rPr>
+                <w:sz w:val="18"/>
+                <w:szCs w:val="18"/>
+              </w:rPr>
+              <w:t>4 (Major)</w:t>
+            </w:r>
+          </w:p>
+        </w:tc>
+        <w:tc>
+          <w:tcPr>
+            <w:tcW w:w="786" w:type="dxa"/>
+            <w:shd w:val="clear" w:color="auto" w:fill="FFF2CC"/>
+          </w:tcPr>
+          <w:p>
+            <w:pPr>
+              <w:spacing w:after="0" w:line="240" w:lineRule="auto"/>
+            </w:pPr>
+            <w:r>
+              <w:rPr>
+                <w:sz w:val="18"/>
+                <w:szCs w:val="18"/>
+              </w:rPr>
+              <w:t>MEDIUM</w:t>
+            </w:r>
+          </w:p>
+        </w:tc>
+        <w:tc>
+          <w:tcPr>
+            <w:tcW w:w="1136" w:type="dxa"/>
+          </w:tcPr>
+          <w:p>
+            <w:pPr>
+              <w:spacing w:after="0" w:line="240" w:lineRule="auto"/>
+            </w:pPr>
+            <w:r>
+              <w:rPr>
+                <w:sz w:val="18"/>
+                <w:szCs w:val="18"/>
+              </w:rPr>
+              <w:t>Backend Lead</w:t>
+            </w:r>
+          </w:p>
+        </w:tc>
+        <w:tc>
+          <w:tcPr>
+            <w:tcW w:w="2579" w:type="dxa"/>
+          </w:tcPr>
+          <w:p>
+            <w:pPr>
+              <w:spacing w:after="0" w:line="240" w:lineRule="auto"/>
+            </w:pPr>
+            <w:r>
+              <w:rPr>
+                <w:sz w:val="18"/>
+                <w:szCs w:val="18"/>
+              </w:rPr>
+              <w:t>Avoid: use the payment provider's hosted checkout fields so card numbers never touch our servers</w:t>
+            </w:r>
+          </w:p>
+        </w:tc>
+        <w:tc>
+          <w:tcPr>
+            <w:tcW w:w="1580" w:type="dxa"/>
+          </w:tcPr>
+          <w:p>
+            <w:pPr>
+              <w:spacing w:after="0" w:line="240" w:lineRule="auto"/>
+            </w:pPr>
+            <w:r>
+              <w:rPr>
+                <w:sz w:val="18"/>
+                <w:szCs w:val="18"/>
+              </w:rPr>
+              <w:t>Closed. Decided during design.</w:t>
+            </w:r>
+          </w:p>
+        </w:tc>
+      </w:tr>
+      <w:tr>
+        <w:trPr>
+          <w:cantSplit/>
+          <w:trHeight w:val="397"/>
+        </w:trPr>
+        <w:tc>
+          <w:tcPr>
+            <w:tcW w:w="1162" w:type="dxa"/>
+          </w:tcPr>
+          <w:p>
+            <w:pPr>
+              <w:spacing w:after="0" w:line="240" w:lineRule="auto"/>
+            </w:pPr>
+            <w:r>
+              <w:rPr>
+                <w:b/>
+                <w:bCs/>
+                <w:sz w:val="18"/>
+                <w:szCs w:val="18"/>
+              </w:rPr>
+              <w:t>P1</w:t>
+            </w:r>
+          </w:p>
+        </w:tc>
+        <w:tc>
+          <w:tcPr>
+            <w:tcW w:w="2185" w:type="dxa"/>
+          </w:tcPr>
+          <w:p>
+            <w:pPr>
+              <w:spacing w:after="0" w:line="240" w:lineRule="auto"/>
+            </w:pPr>
+            <w:r>
+              <w:rPr>
+                <w:sz w:val="18"/>
+                <w:szCs w:val="18"/>
+              </w:rPr>
+              <w:t>Midterms and finals cut team availability</w:t>
+            </w:r>
+          </w:p>
+        </w:tc>
+        <w:tc>
+          <w:tcPr>
+            <w:tcW w:w="1180" w:type="dxa"/>
+          </w:tcPr>
+          <w:p>
+            <w:pPr>
+              <w:spacing w:after="0" w:line="240" w:lineRule="auto"/>
+            </w:pPr>
+            <w:r>
+              <w:rPr>
+                <w:sz w:val="18"/>
+                <w:szCs w:val="18"/>
+              </w:rPr>
+              <w:t>4 (High)</w:t>
+            </w:r>
+          </w:p>
+        </w:tc>
+        <w:tc>
+          <w:tcPr>
+            <w:tcW w:w="1267" w:type="dxa"/>
+          </w:tcPr>
+          <w:p>
+            <w:pPr>
+              <w:spacing w:after="0" w:line="240" w:lineRule="auto"/>
+            </w:pPr>
+            <w:r>
+              <w:rPr>
+                <w:sz w:val="18"/>
+                <w:szCs w:val="18"/>
+              </w:rPr>
+              <w:t>3 (Moderate)</w:t>
+            </w:r>
+          </w:p>
+        </w:tc>
+        <w:tc>
+          <w:tcPr>
+            <w:tcW w:w="786" w:type="dxa"/>
+            <w:shd w:val="clear" w:color="auto" w:fill="F4CCCC"/>
+          </w:tcPr>
+          <w:p>
+            <w:pPr>
+              <w:spacing w:after="0" w:line="240" w:lineRule="auto"/>
+            </w:pPr>
+            <w:r>
+              <w:rPr>
+                <w:sz w:val="18"/>
+                <w:szCs w:val="18"/>
+              </w:rPr>
+              <w:t>HIGH</w:t>
+            </w:r>
+          </w:p>
+        </w:tc>
+        <w:tc>
+          <w:tcPr>
+            <w:tcW w:w="1136" w:type="dxa"/>
+          </w:tcPr>
+          <w:p>
+            <w:pPr>
+              <w:spacing w:after="0" w:line="240" w:lineRule="auto"/>
+            </w:pPr>
+            <w:r>
+              <w:rPr>
+                <w:sz w:val="18"/>
+                <w:szCs w:val="18"/>
+              </w:rPr>
+              <w:t>Project Manager</w:t>
+            </w:r>
+          </w:p>
+        </w:tc>
+        <w:tc>
+          <w:tcPr>
+            <w:tcW w:w="2579" w:type="dxa"/>
+          </w:tcPr>
+          <w:p>
+            <w:pPr>
+              <w:spacing w:after="0" w:line="240" w:lineRule="auto"/>
+            </w:pPr>
+            <w:r>
+              <w:rPr>
+                <w:sz w:val="18"/>
+                <w:szCs w:val="18"/>
+              </w:rPr>
+              <w:t>Mitigate: plan lighter sprints during exam weeks using the UH calendar</w:t>
+            </w:r>
+          </w:p>
+        </w:tc>
+        <w:tc>
+          <w:tcPr>
+            <w:tcW w:w="1580" w:type="dxa"/>
+          </w:tcPr>
+          <w:p>
+            <w:pPr>
+              <w:spacing w:after="0" w:line="240" w:lineRule="auto"/>
+            </w:pPr>
+            <w:r>
+              <w:rPr>
+                <w:sz w:val="18"/>
+                <w:szCs w:val="18"/>
+              </w:rPr>
+              <w:t>Monitoring.</w:t>
+            </w:r>
+          </w:p>
+        </w:tc>
+      </w:tr>
+      <w:tr>
+        <w:trPr>
+          <w:cantSplit/>
+          <w:trHeight w:val="591"/>
+        </w:trPr>
+        <w:tc>
+          <w:tcPr>
+            <w:tcW w:w="1162" w:type="dxa"/>
+          </w:tcPr>
+          <w:p>
+            <w:pPr>
+              <w:spacing w:after="0" w:line="240" w:lineRule="auto"/>
+            </w:pPr>
+            <w:r>
+              <w:rPr>
+                <w:b/>
+                <w:bCs/>
+                <w:sz w:val="18"/>
+                <w:szCs w:val="18"/>
+              </w:rPr>
+              <w:t>P2</w:t>
+            </w:r>
+          </w:p>
+        </w:tc>
+        <w:tc>
+          <w:tcPr>
+            <w:tcW w:w="2185" w:type="dxa"/>
+          </w:tcPr>
+          <w:p>
+            <w:pPr>
+              <w:spacing w:after="0" w:line="240" w:lineRule="auto"/>
+            </w:pPr>
+            <w:r>
+              <w:rPr>
+                <w:sz w:val="18"/>
+                <w:szCs w:val="18"/>
+              </w:rPr>
+              <w:t>Only one person knows the payment setup</w:t>
+            </w:r>
+          </w:p>
+        </w:tc>
+        <w:tc>
+          <w:tcPr>
+            <w:tcW w:w="1180" w:type="dxa"/>
+          </w:tcPr>
+          <w:p>
+            <w:pPr>
+              <w:spacing w:after="0" w:line="240" w:lineRule="auto"/>
+            </w:pPr>
+            <w:r>
+              <w:rPr>
+                <w:sz w:val="18"/>
+                <w:szCs w:val="18"/>
+              </w:rPr>
+              <w:t>2 (Low)</w:t>
+            </w:r>
+          </w:p>
+        </w:tc>
+        <w:tc>
+          <w:tcPr>
+            <w:tcW w:w="1267" w:type="dxa"/>
+          </w:tcPr>
+          <w:p>
+            <w:pPr>
+              <w:spacing w:after="0" w:line="240" w:lineRule="auto"/>
+            </w:pPr>
+            <w:r>
+              <w:rPr>
+                <w:sz w:val="18"/>
+                <w:szCs w:val="18"/>
+              </w:rPr>
+              <w:t>4 (Major)</w:t>
+            </w:r>
+          </w:p>
+        </w:tc>
+        <w:tc>
+          <w:tcPr>
+            <w:tcW w:w="786" w:type="dxa"/>
+            <w:shd w:val="clear" w:color="auto" w:fill="FFF2CC"/>
+          </w:tcPr>
+          <w:p>
+            <w:pPr>
+              <w:spacing w:after="0" w:line="240" w:lineRule="auto"/>
+            </w:pPr>
+            <w:r>
+              <w:rPr>
+                <w:sz w:val="18"/>
+                <w:szCs w:val="18"/>
+              </w:rPr>
+              <w:t>MEDIUM</w:t>
+            </w:r>
+          </w:p>
+        </w:tc>
+        <w:tc>
+          <w:tcPr>
+            <w:tcW w:w="1136" w:type="dxa"/>
+          </w:tcPr>
+          <w:p>
+            <w:pPr>
+              <w:spacing w:after="0" w:line="240" w:lineRule="auto"/>
+            </w:pPr>
+            <w:r>
+              <w:rPr>
+                <w:sz w:val="18"/>
+                <w:szCs w:val="18"/>
+              </w:rPr>
+              <w:t>Project Manager</w:t>
+            </w:r>
+          </w:p>
+        </w:tc>
+        <w:tc>
+          <w:tcPr>
+            <w:tcW w:w="2579" w:type="dxa"/>
+          </w:tcPr>
+          <w:p>
+            <w:pPr>
+              <w:spacing w:after="0" w:line="240" w:lineRule="auto"/>
+            </w:pPr>
+            <w:r>
+              <w:rPr>
+                <w:sz w:val="18"/>
+                <w:szCs w:val="18"/>
+              </w:rPr>
+              <w:t>Mitigate: pair a second person on payment work and keep setup notes in the repo</w:t>
+            </w:r>
+          </w:p>
+        </w:tc>
+        <w:tc>
+          <w:tcPr>
+            <w:tcW w:w="1580" w:type="dxa"/>
+          </w:tcPr>
+          <w:p>
+            <w:pPr>
+              <w:spacing w:after="0" w:line="240" w:lineRule="auto"/>
+            </w:pPr>
+            <w:r>
+              <w:rPr>
+                <w:sz w:val="18"/>
+                <w:szCs w:val="18"/>
+              </w:rPr>
+              <w:t>Open.</w:t>
+            </w:r>
+          </w:p>
+        </w:tc>
+      </w:tr>
+      <w:tr>
+        <w:trPr>
+          <w:cantSplit/>
+          <w:trHeight w:val="582"/>
+        </w:trPr>
+        <w:tc>
+          <w:tcPr>
+            <w:tcW w:w="1162" w:type="dxa"/>
+          </w:tcPr>
+          <w:p>
+            <w:pPr>
+              <w:spacing w:after="0" w:line="240" w:lineRule="auto"/>
+            </w:pPr>
+            <w:r>
+              <w:rPr>
+                <w:b/>
+                <w:bCs/>
+                <w:sz w:val="18"/>
+                <w:szCs w:val="18"/>
+              </w:rPr>
+              <w:t>P3</w:t>
+            </w:r>
+          </w:p>
+        </w:tc>
+        <w:tc>
+          <w:tcPr>
+            <w:tcW w:w="2185" w:type="dxa"/>
+          </w:tcPr>
+          <w:p>
+            <w:pPr>
+              <w:spacing w:after="0" w:line="240" w:lineRule="auto"/>
+            </w:pPr>
+            <w:r>
+              <w:rPr>
+                <w:sz w:val="18"/>
+                <w:szCs w:val="18"/>
+              </w:rPr>
+              <w:t>Operators push for out-of-scope features</w:t>
+            </w:r>
+          </w:p>
+        </w:tc>
+        <w:tc>
+          <w:tcPr>
+            <w:tcW w:w="1180" w:type="dxa"/>
+          </w:tcPr>
+          <w:p>
+            <w:pPr>
+              <w:spacing w:after="0" w:line="240" w:lineRule="auto"/>
+            </w:pPr>
+            <w:r>
+              <w:rPr>
+                <w:sz w:val="18"/>
+                <w:szCs w:val="18"/>
+              </w:rPr>
+              <w:t>3 (Moderate)</w:t>
+            </w:r>
+          </w:p>
+        </w:tc>
+        <w:tc>
+          <w:tcPr>
+            <w:tcW w:w="1267" w:type="dxa"/>
+          </w:tcPr>
+          <w:p>
+            <w:pPr>
+              <w:spacing w:after="0" w:line="240" w:lineRule="auto"/>
+            </w:pPr>
+            <w:r>
+              <w:rPr>
+                <w:sz w:val="18"/>
+                <w:szCs w:val="18"/>
+              </w:rPr>
+              <w:t>3 (Moderate)</w:t>
+            </w:r>
+          </w:p>
+        </w:tc>
+        <w:tc>
+          <w:tcPr>
+            <w:tcW w:w="786" w:type="dxa"/>
+            <w:shd w:val="clear" w:color="auto" w:fill="FFF2CC"/>
+          </w:tcPr>
+          <w:p>
+            <w:pPr>
+              <w:spacing w:after="0" w:line="240" w:lineRule="auto"/>
+            </w:pPr>
+            <w:r>
+              <w:rPr>
+                <w:sz w:val="18"/>
+                <w:szCs w:val="18"/>
+              </w:rPr>
+              <w:t>MEDIUM</w:t>
+            </w:r>
+          </w:p>
+        </w:tc>
+        <w:tc>
+          <w:tcPr>
+            <w:tcW w:w="1136" w:type="dxa"/>
+          </w:tcPr>
+          <w:p>
+            <w:pPr>
+              <w:spacing w:after="0" w:line="240" w:lineRule="auto"/>
+            </w:pPr>
+            <w:r>
+              <w:rPr>
+                <w:sz w:val="18"/>
+                <w:szCs w:val="18"/>
+              </w:rPr>
+              <w:t>Product Owner</w:t>
+            </w:r>
+          </w:p>
+        </w:tc>
+        <w:tc>
+          <w:tcPr>
+            <w:tcW w:w="2579" w:type="dxa"/>
+          </w:tcPr>
+          <w:p>
+            <w:pPr>
+              <w:spacing w:after="0" w:line="240" w:lineRule="auto"/>
+            </w:pPr>
+            <w:r>
+              <w:rPr>
+                <w:sz w:val="18"/>
+                <w:szCs w:val="18"/>
+              </w:rPr>
+              <w:t>Mitigate: new requests go to sprint review and get checked against the Vision and Scope section</w:t>
+            </w:r>
+          </w:p>
+        </w:tc>
+        <w:tc>
+          <w:tcPr>
+            <w:tcW w:w="1580" w:type="dxa"/>
+          </w:tcPr>
+          <w:p>
+            <w:pPr>
+              <w:spacing w:after="0" w:line="240" w:lineRule="auto"/>
+            </w:pPr>
+            <w:r>
+              <w:rPr>
+                <w:sz w:val="18"/>
+                <w:szCs w:val="18"/>
+              </w:rPr>
+              <w:t>Open.</w:t>
+            </w:r>
+          </w:p>
+        </w:tc>
+      </w:tr>
+    </w:tbl>
+    <w:p/>
     <w:sectPr>
       <w:pgSz w:w="12240" w:h="15840"/>
       <w:pgMar w:top="1440" w:right="1440" w:bottom="1440" w:left="1440" w:header="720" w:footer="720" w:gutter="0"/>
@@ -6029,6 +8169,56 @@
     </w:sectPr>
   </w:body>
 </w:document>
+</file>
+
+<file path=word/endnotes.xml><?xml version="1.0" encoding="utf-8"?>
+<w:endnotes xmlns:wpc="http://schemas.microsoft.com/office/word/2010/wordprocessingCanvas" xmlns:cx="http://schemas.microsoft.com/office/drawing/2014/chartex" xmlns:cx1="http://schemas.microsoft.com/office/drawing/2015/9/8/chartex" xmlns:cx2="http://schemas.microsoft.com/office/drawing/2015/10/21/chartex" xmlns:cx3="http://schemas.microsoft.com/office/drawing/2016/5/9/chartex" xmlns:cx4="http://schemas.microsoft.com/office/drawing/2016/5/10/chartex" xmlns:cx5="http://schemas.microsoft.com/office/drawing/2016/5/11/chartex" xmlns:cx6="http://schemas.microsoft.com/office/drawing/2016/5/12/chartex" xmlns:cx7="http://schemas.microsoft.com/office/drawing/2016/5/13/chartex" xmlns:cx8="http://schemas.microsoft.com/office/drawing/2016/5/14/chartex" xmlns:mc="http://schemas.openxmlformats.org/markup-compatibility/2006" xmlns:m="http://schemas.openxmlformats.org/officeDocument/2006/math" xmlns:aink="http://schemas.microsoft.com/office/drawing/2016/ink" xmlns:am3d="http://schemas.microsoft.com/office/drawing/2017/model3d" xmlns:oel="http://schemas.microsoft.com/office/2019/extlst" xmlns:r="http://schemas.openxmlformats.org/officeDocument/2006/relationships" xmlns:wp14="http://schemas.microsoft.com/office/word/2010/wordprocessingDrawing" xmlns:wp="http://schemas.openxmlformats.org/drawingml/2006/wordprocessingDrawing" xmlns:wpg="http://schemas.microsoft.com/office/word/2010/wordprocessingGroup" xmlns:wpi="http://schemas.microsoft.com/office/word/2010/wordprocessingInk" xmlns:wps="http://schemas.microsoft.com/office/word/2010/wordprocessingShape" xmlns:o="urn:schemas-microsoft-com:office:office" xmlns:v="urn:schemas-microsoft-com:vml" xmlns:w10="urn:schemas-microsoft-com:office:word" xmlns:w="http://schemas.openxmlformats.org/wordprocessingml/2006/main" xmlns:w14="http://schemas.microsoft.com/office/word/2010/wordml" xmlns:w15="http://schemas.microsoft.com/office/word/2012/wordml" xmlns:w16cex="http://schemas.microsoft.com/office/word/2018/wordml/cex" xmlns:w16cid="http://schemas.microsoft.com/office/word/2016/wordml/cid" xmlns:w16="http://schemas.microsoft.com/office/word/2018/wordml" xmlns:w16sdtdh="http://schemas.microsoft.com/office/word/2020/wordml/sdtdatahash" xmlns:w16sdtfl="http://schemas.microsoft.com/office/word/2024/wordml/sdtformatlock" xmlns:w16se="http://schemas.microsoft.com/office/word/2015/wordml/symex" xmlns:w16du="http://schemas.microsoft.com/office/word/2023/wordml/word16du" xmlns:wne="http://schemas.microsoft.com/office/word/2006/wordml" mc:Ignorable="w14 w15 w16se w16cid w16 w16cex w16sdtdh w16sdtfl w16du wp14">
+  <w:endnote w:type="separator" w:id="-1">
+    <w:p>
+      <w:pPr>
+        <w:spacing w:after="0" w:line="240" w:lineRule="auto"/>
+      </w:pPr>
+      <w:r>
+        <w:separator/>
+      </w:r>
+    </w:p>
+  </w:endnote>
+  <w:endnote w:type="continuationSeparator" w:id="0">
+    <w:p>
+      <w:pPr>
+        <w:spacing w:after="0" w:line="240" w:lineRule="auto"/>
+      </w:pPr>
+      <w:r>
+        <w:continuationSeparator/>
+      </w:r>
+    </w:p>
+  </w:endnote>
+</w:endnotes>
+</file>
+
+<file path=word/footnotes.xml><?xml version="1.0" encoding="utf-8"?>
+<w:footnotes xmlns:wpc="http://schemas.microsoft.com/office/word/2010/wordprocessingCanvas" xmlns:cx="http://schemas.microsoft.com/office/drawing/2014/chartex" xmlns:cx1="http://schemas.microsoft.com/office/drawing/2015/9/8/chartex" xmlns:cx2="http://schemas.microsoft.com/office/drawing/2015/10/21/chartex" xmlns:cx3="http://schemas.microsoft.com/office/drawing/2016/5/9/chartex" xmlns:cx4="http://schemas.microsoft.com/office/drawing/2016/5/10/chartex" xmlns:cx5="http://schemas.microsoft.com/office/drawing/2016/5/11/chartex" xmlns:cx6="http://schemas.microsoft.com/office/drawing/2016/5/12/chartex" xmlns:cx7="http://schemas.microsoft.com/office/drawing/2016/5/13/chartex" xmlns:cx8="http://schemas.microsoft.com/office/drawing/2016/5/14/chartex" xmlns:mc="http://schemas.openxmlformats.org/markup-compatibility/2006" xmlns:m="http://schemas.openxmlformats.org/officeDocument/2006/math" xmlns:aink="http://schemas.microsoft.com/office/drawing/2016/ink" xmlns:am3d="http://schemas.microsoft.com/office/drawing/2017/model3d" xmlns:oel="http://schemas.microsoft.com/office/2019/extlst" xmlns:r="http://schemas.openxmlformats.org/officeDocument/2006/relationships" xmlns:wp14="http://schemas.microsoft.com/office/word/2010/wordprocessingDrawing" xmlns:wp="http://schemas.openxmlformats.org/drawingml/2006/wordprocessingDrawing" xmlns:wpg="http://schemas.microsoft.com/office/word/2010/wordprocessingGroup" xmlns:wpi="http://schemas.microsoft.com/office/word/2010/wordprocessingInk" xmlns:wps="http://schemas.microsoft.com/office/word/2010/wordprocessingShape" xmlns:o="urn:schemas-microsoft-com:office:office" xmlns:v="urn:schemas-microsoft-com:vml" xmlns:w10="urn:schemas-microsoft-com:office:word" xmlns:w="http://schemas.openxmlformats.org/wordprocessingml/2006/main" xmlns:w14="http://schemas.microsoft.com/office/word/2010/wordml" xmlns:w15="http://schemas.microsoft.com/office/word/2012/wordml" xmlns:w16cex="http://schemas.microsoft.com/office/word/2018/wordml/cex" xmlns:w16cid="http://schemas.microsoft.com/office/word/2016/wordml/cid" xmlns:w16="http://schemas.microsoft.com/office/word/2018/wordml" xmlns:w16sdtdh="http://schemas.microsoft.com/office/word/2020/wordml/sdtdatahash" xmlns:w16sdtfl="http://schemas.microsoft.com/office/word/2024/wordml/sdtformatlock" xmlns:w16se="http://schemas.microsoft.com/office/word/2015/wordml/symex" xmlns:w16du="http://schemas.microsoft.com/office/word/2023/wordml/word16du" xmlns:wne="http://schemas.microsoft.com/office/word/2006/wordml" mc:Ignorable="w14 w15 w16se w16cid w16 w16cex w16sdtdh w16sdtfl w16du wp14">
+  <w:footnote w:type="separator" w:id="-1">
+    <w:p>
+      <w:pPr>
+        <w:spacing w:after="0" w:line="240" w:lineRule="auto"/>
+      </w:pPr>
+      <w:r>
+        <w:separator/>
+      </w:r>
+    </w:p>
+  </w:footnote>
+  <w:footnote w:type="continuationSeparator" w:id="0">
+    <w:p>
+      <w:pPr>
+        <w:spacing w:after="0" w:line="240" w:lineRule="auto"/>
+      </w:pPr>
+      <w:r>
+        <w:continuationSeparator/>
+      </w:r>
+    </w:p>
+  </w:footnote>
+</w:footnotes>
 </file>
 
 <file path=word/numbering.xml><?xml version="1.0" encoding="utf-8"?>
@@ -7624,6 +9814,50 @@
       <w:color w:val="0F4761" w:themeColor="accent1" w:themeShade="BF"/>
       <w:spacing w:val="5"/>
     </w:rPr>
+  </w:style>
+  <w:style w:type="paragraph" w:styleId="Header">
+    <w:name w:val="header"/>
+    <w:basedOn w:val="Normal"/>
+    <w:link w:val="HeaderChar"/>
+    <w:uiPriority w:val="99"/>
+    <w:unhideWhenUsed/>
+    <w:rsid w:val="002674F6"/>
+    <w:pPr>
+      <w:tabs>
+        <w:tab w:val="center" w:pos="4680"/>
+        <w:tab w:val="right" w:pos="9360"/>
+      </w:tabs>
+      <w:spacing w:after="0" w:line="240" w:lineRule="auto"/>
+    </w:pPr>
+  </w:style>
+  <w:style w:type="character" w:customStyle="1" w:styleId="HeaderChar">
+    <w:name w:val="Header Char"/>
+    <w:basedOn w:val="DefaultParagraphFont"/>
+    <w:link w:val="Header"/>
+    <w:uiPriority w:val="99"/>
+    <w:rsid w:val="002674F6"/>
+  </w:style>
+  <w:style w:type="paragraph" w:styleId="Footer">
+    <w:name w:val="footer"/>
+    <w:basedOn w:val="Normal"/>
+    <w:link w:val="FooterChar"/>
+    <w:uiPriority w:val="99"/>
+    <w:unhideWhenUsed/>
+    <w:rsid w:val="002674F6"/>
+    <w:pPr>
+      <w:tabs>
+        <w:tab w:val="center" w:pos="4680"/>
+        <w:tab w:val="right" w:pos="9360"/>
+      </w:tabs>
+      <w:spacing w:after="0" w:line="240" w:lineRule="auto"/>
+    </w:pPr>
+  </w:style>
+  <w:style w:type="character" w:customStyle="1" w:styleId="FooterChar">
+    <w:name w:val="Footer Char"/>
+    <w:basedOn w:val="DefaultParagraphFont"/>
+    <w:link w:val="Footer"/>
+    <w:uiPriority w:val="99"/>
+    <w:rsid w:val="002674F6"/>
   </w:style>
 </w:styles>
 </file>

</xml_diff>